<commit_message>
fix: bind format validation to generated artifacts
</commit_message>
<xml_diff>
--- a/tests/formats/output/career-entry-12-week-roadmap/brief.docx
+++ b/tests/formats/output/career-entry-12-week-roadmap/brief.docx
@@ -168,6 +168,10 @@
           <w:tcPr>
             <w:tcW w:type="dxa" w:w="2700"/>
             <w:shd w:fill="E8EEF5"/>
+            <w:tcMar>
+              <w:left w:w="120" w:type="dxa"/>
+              <w:right w:w="120" w:type="dxa"/>
+            </w:tcMar>
           </w:tcPr>
           <w:p>
             <w:r/>
@@ -186,6 +190,10 @@
           <w:tcPr>
             <w:tcW w:type="dxa" w:w="6660"/>
             <w:shd w:fill="E8EEF5"/>
+            <w:tcMar>
+              <w:left w:w="120" w:type="dxa"/>
+              <w:right w:w="120" w:type="dxa"/>
+            </w:tcMar>
           </w:tcPr>
           <w:p>
             <w:r/>
@@ -205,6 +213,10 @@
         <w:tc>
           <w:tcPr>
             <w:tcW w:type="dxa" w:w="2700"/>
+            <w:tcMar>
+              <w:left w:w="120" w:type="dxa"/>
+              <w:right w:w="120" w:type="dxa"/>
+            </w:tcMar>
           </w:tcPr>
           <w:p>
             <w:r/>
@@ -222,6 +234,10 @@
         <w:tc>
           <w:tcPr>
             <w:tcW w:type="dxa" w:w="6660"/>
+            <w:tcMar>
+              <w:left w:w="120" w:type="dxa"/>
+              <w:right w:w="120" w:type="dxa"/>
+            </w:tcMar>
           </w:tcPr>
           <w:p>
             <w:r/>
@@ -241,6 +257,10 @@
         <w:tc>
           <w:tcPr>
             <w:tcW w:type="dxa" w:w="2700"/>
+            <w:tcMar>
+              <w:left w:w="120" w:type="dxa"/>
+              <w:right w:w="120" w:type="dxa"/>
+            </w:tcMar>
           </w:tcPr>
           <w:p>
             <w:r/>
@@ -258,6 +278,10 @@
         <w:tc>
           <w:tcPr>
             <w:tcW w:type="dxa" w:w="6660"/>
+            <w:tcMar>
+              <w:left w:w="120" w:type="dxa"/>
+              <w:right w:w="120" w:type="dxa"/>
+            </w:tcMar>
           </w:tcPr>
           <w:p>
             <w:r/>
@@ -277,6 +301,10 @@
         <w:tc>
           <w:tcPr>
             <w:tcW w:type="dxa" w:w="2700"/>
+            <w:tcMar>
+              <w:left w:w="120" w:type="dxa"/>
+              <w:right w:w="120" w:type="dxa"/>
+            </w:tcMar>
           </w:tcPr>
           <w:p>
             <w:r/>
@@ -294,6 +322,10 @@
         <w:tc>
           <w:tcPr>
             <w:tcW w:type="dxa" w:w="6660"/>
+            <w:tcMar>
+              <w:left w:w="120" w:type="dxa"/>
+              <w:right w:w="120" w:type="dxa"/>
+            </w:tcMar>
           </w:tcPr>
           <w:p>
             <w:r/>
@@ -313,6 +345,10 @@
         <w:tc>
           <w:tcPr>
             <w:tcW w:type="dxa" w:w="2700"/>
+            <w:tcMar>
+              <w:left w:w="120" w:type="dxa"/>
+              <w:right w:w="120" w:type="dxa"/>
+            </w:tcMar>
           </w:tcPr>
           <w:p>
             <w:r/>
@@ -330,6 +366,10 @@
         <w:tc>
           <w:tcPr>
             <w:tcW w:type="dxa" w:w="6660"/>
+            <w:tcMar>
+              <w:left w:w="120" w:type="dxa"/>
+              <w:right w:w="120" w:type="dxa"/>
+            </w:tcMar>
           </w:tcPr>
           <w:p>
             <w:r/>
@@ -395,15 +435,19 @@
         <w:tblInd w:w="120" w:type="dxa"/>
       </w:tblPr>
       <w:tblGrid>
-        <w:gridCol w:w="900"/>
-        <w:gridCol w:w="4230"/>
-        <w:gridCol w:w="4230"/>
+        <w:gridCol w:w="1100"/>
+        <w:gridCol w:w="4130"/>
+        <w:gridCol w:w="4130"/>
       </w:tblGrid>
       <w:tr>
         <w:tc>
           <w:tcPr>
-            <w:tcW w:type="dxa" w:w="900"/>
+            <w:tcW w:type="dxa" w:w="1100"/>
             <w:shd w:fill="E8EEF5"/>
+            <w:tcMar>
+              <w:left w:w="120" w:type="dxa"/>
+              <w:right w:w="120" w:type="dxa"/>
+            </w:tcMar>
           </w:tcPr>
           <w:p>
             <w:r/>
@@ -412,7 +456,7 @@
                 <w:rFonts w:ascii="D2Coding" w:hAnsi="D2Coding" w:eastAsia="D2Coding" w:hint="eastAsia"/>
                 <w:b/>
                 <w:color w:val="0F172A"/>
-                <w:sz w:val="18"/>
+                <w:sz w:val="17"/>
               </w:rPr>
               <w:t>주</w:t>
             </w:r>
@@ -420,8 +464,12 @@
         </w:tc>
         <w:tc>
           <w:tcPr>
-            <w:tcW w:type="dxa" w:w="4230"/>
+            <w:tcW w:type="dxa" w:w="4130"/>
             <w:shd w:fill="E8EEF5"/>
+            <w:tcMar>
+              <w:left w:w="120" w:type="dxa"/>
+              <w:right w:w="120" w:type="dxa"/>
+            </w:tcMar>
           </w:tcPr>
           <w:p>
             <w:r/>
@@ -430,7 +478,7 @@
                 <w:rFonts w:ascii="D2Coding" w:hAnsi="D2Coding" w:eastAsia="D2Coding" w:hint="eastAsia"/>
                 <w:b/>
                 <w:color w:val="0F172A"/>
-                <w:sz w:val="18"/>
+                <w:sz w:val="17"/>
               </w:rPr>
               <w:t>학습</w:t>
             </w:r>
@@ -438,8 +486,12 @@
         </w:tc>
         <w:tc>
           <w:tcPr>
-            <w:tcW w:type="dxa" w:w="4230"/>
+            <w:tcW w:type="dxa" w:w="4130"/>
             <w:shd w:fill="E8EEF5"/>
+            <w:tcMar>
+              <w:left w:w="120" w:type="dxa"/>
+              <w:right w:w="120" w:type="dxa"/>
+            </w:tcMar>
           </w:tcPr>
           <w:p>
             <w:r/>
@@ -448,7 +500,7 @@
                 <w:rFonts w:ascii="D2Coding" w:hAnsi="D2Coding" w:eastAsia="D2Coding" w:hint="eastAsia"/>
                 <w:b/>
                 <w:color w:val="0F172A"/>
-                <w:sz w:val="18"/>
+                <w:sz w:val="17"/>
               </w:rPr>
               <w:t>연습</w:t>
             </w:r>
@@ -458,7 +510,11 @@
       <w:tr>
         <w:tc>
           <w:tcPr>
-            <w:tcW w:type="dxa" w:w="900"/>
+            <w:tcW w:type="dxa" w:w="1100"/>
+            <w:tcMar>
+              <w:left w:w="120" w:type="dxa"/>
+              <w:right w:w="120" w:type="dxa"/>
+            </w:tcMar>
           </w:tcPr>
           <w:p>
             <w:r/>
@@ -467,15 +523,19 @@
                 <w:rFonts w:ascii="D2Coding" w:hAnsi="D2Coding" w:eastAsia="D2Coding" w:hint="eastAsia"/>
                 <w:b w:val="0"/>
                 <w:color w:val="0F172A"/>
-                <w:sz w:val="18"/>
+                <w:sz w:val="17"/>
               </w:rPr>
-              <w:t>1</w:t>
+              <w:t>1주</w:t>
             </w:r>
           </w:p>
         </w:tc>
         <w:tc>
           <w:tcPr>
-            <w:tcW w:type="dxa" w:w="4230"/>
+            <w:tcW w:type="dxa" w:w="4130"/>
+            <w:tcMar>
+              <w:left w:w="120" w:type="dxa"/>
+              <w:right w:w="120" w:type="dxa"/>
+            </w:tcMar>
           </w:tcPr>
           <w:p>
             <w:r/>
@@ -484,7 +544,7 @@
                 <w:rFonts w:ascii="D2Coding" w:hAnsi="D2Coding" w:eastAsia="D2Coding" w:hint="eastAsia"/>
                 <w:b w:val="0"/>
                 <w:color w:val="0F172A"/>
-                <w:sz w:val="18"/>
+                <w:sz w:val="17"/>
               </w:rPr>
               <w:t>Core loop and player goal</w:t>
             </w:r>
@@ -492,7 +552,11 @@
         </w:tc>
         <w:tc>
           <w:tcPr>
-            <w:tcW w:type="dxa" w:w="4230"/>
+            <w:tcW w:type="dxa" w:w="4130"/>
+            <w:tcMar>
+              <w:left w:w="120" w:type="dxa"/>
+              <w:right w:w="120" w:type="dxa"/>
+            </w:tcMar>
           </w:tcPr>
           <w:p>
             <w:r/>
@@ -501,7 +565,7 @@
                 <w:rFonts w:ascii="D2Coding" w:hAnsi="D2Coding" w:eastAsia="D2Coding" w:hint="eastAsia"/>
                 <w:b w:val="0"/>
                 <w:color w:val="0F172A"/>
-                <w:sz w:val="18"/>
+                <w:sz w:val="17"/>
               </w:rPr>
               <w:t>Describe one loop and its decision points</w:t>
             </w:r>
@@ -511,7 +575,11 @@
       <w:tr>
         <w:tc>
           <w:tcPr>
-            <w:tcW w:type="dxa" w:w="900"/>
+            <w:tcW w:type="dxa" w:w="1100"/>
+            <w:tcMar>
+              <w:left w:w="120" w:type="dxa"/>
+              <w:right w:w="120" w:type="dxa"/>
+            </w:tcMar>
           </w:tcPr>
           <w:p>
             <w:r/>
@@ -520,15 +588,19 @@
                 <w:rFonts w:ascii="D2Coding" w:hAnsi="D2Coding" w:eastAsia="D2Coding" w:hint="eastAsia"/>
                 <w:b w:val="0"/>
                 <w:color w:val="0F172A"/>
-                <w:sz w:val="18"/>
+                <w:sz w:val="17"/>
               </w:rPr>
-              <w:t>2</w:t>
+              <w:t>2주</w:t>
             </w:r>
           </w:p>
         </w:tc>
         <w:tc>
           <w:tcPr>
-            <w:tcW w:type="dxa" w:w="4230"/>
+            <w:tcW w:type="dxa" w:w="4130"/>
+            <w:tcMar>
+              <w:left w:w="120" w:type="dxa"/>
+              <w:right w:w="120" w:type="dxa"/>
+            </w:tcMar>
           </w:tcPr>
           <w:p>
             <w:r/>
@@ -537,7 +609,7 @@
                 <w:rFonts w:ascii="D2Coding" w:hAnsi="D2Coding" w:eastAsia="D2Coding" w:hint="eastAsia"/>
                 <w:b w:val="0"/>
                 <w:color w:val="0F172A"/>
-                <w:sz w:val="18"/>
+                <w:sz w:val="17"/>
               </w:rPr>
               <w:t>Rules and state transitions</w:t>
             </w:r>
@@ -545,7 +617,11 @@
         </w:tc>
         <w:tc>
           <w:tcPr>
-            <w:tcW w:type="dxa" w:w="4230"/>
+            <w:tcW w:type="dxa" w:w="4130"/>
+            <w:tcMar>
+              <w:left w:w="120" w:type="dxa"/>
+              <w:right w:w="120" w:type="dxa"/>
+            </w:tcMar>
           </w:tcPr>
           <w:p>
             <w:r/>
@@ -554,7 +630,7 @@
                 <w:rFonts w:ascii="D2Coding" w:hAnsi="D2Coding" w:eastAsia="D2Coding" w:hint="eastAsia"/>
                 <w:b w:val="0"/>
                 <w:color w:val="0F172A"/>
-                <w:sz w:val="18"/>
+                <w:sz w:val="17"/>
               </w:rPr>
               <w:t>Build a state table</w:t>
             </w:r>
@@ -564,7 +640,11 @@
       <w:tr>
         <w:tc>
           <w:tcPr>
-            <w:tcW w:type="dxa" w:w="900"/>
+            <w:tcW w:type="dxa" w:w="1100"/>
+            <w:tcMar>
+              <w:left w:w="120" w:type="dxa"/>
+              <w:right w:w="120" w:type="dxa"/>
+            </w:tcMar>
           </w:tcPr>
           <w:p>
             <w:r/>
@@ -573,15 +653,19 @@
                 <w:rFonts w:ascii="D2Coding" w:hAnsi="D2Coding" w:eastAsia="D2Coding" w:hint="eastAsia"/>
                 <w:b w:val="0"/>
                 <w:color w:val="0F172A"/>
-                <w:sz w:val="18"/>
+                <w:sz w:val="17"/>
               </w:rPr>
-              <w:t>3</w:t>
+              <w:t>3주</w:t>
             </w:r>
           </w:p>
         </w:tc>
         <w:tc>
           <w:tcPr>
-            <w:tcW w:type="dxa" w:w="4230"/>
+            <w:tcW w:type="dxa" w:w="4130"/>
+            <w:tcMar>
+              <w:left w:w="120" w:type="dxa"/>
+              <w:right w:w="120" w:type="dxa"/>
+            </w:tcMar>
           </w:tcPr>
           <w:p>
             <w:r/>
@@ -590,7 +674,7 @@
                 <w:rFonts w:ascii="D2Coding" w:hAnsi="D2Coding" w:eastAsia="D2Coding" w:hint="eastAsia"/>
                 <w:b w:val="0"/>
                 <w:color w:val="0F172A"/>
-                <w:sz w:val="18"/>
+                <w:sz w:val="17"/>
               </w:rPr>
               <w:t>Exceptions and failure recovery</w:t>
             </w:r>
@@ -598,7 +682,11 @@
         </w:tc>
         <w:tc>
           <w:tcPr>
-            <w:tcW w:type="dxa" w:w="4230"/>
+            <w:tcW w:type="dxa" w:w="4130"/>
+            <w:tcMar>
+              <w:left w:w="120" w:type="dxa"/>
+              <w:right w:w="120" w:type="dxa"/>
+            </w:tcMar>
           </w:tcPr>
           <w:p>
             <w:r/>
@@ -607,7 +695,7 @@
                 <w:rFonts w:ascii="D2Coding" w:hAnsi="D2Coding" w:eastAsia="D2Coding" w:hint="eastAsia"/>
                 <w:b w:val="0"/>
                 <w:color w:val="0F172A"/>
-                <w:sz w:val="18"/>
+                <w:sz w:val="17"/>
               </w:rPr>
               <w:t>Add edge cases</w:t>
             </w:r>
@@ -617,7 +705,11 @@
       <w:tr>
         <w:tc>
           <w:tcPr>
-            <w:tcW w:type="dxa" w:w="900"/>
+            <w:tcW w:type="dxa" w:w="1100"/>
+            <w:tcMar>
+              <w:left w:w="120" w:type="dxa"/>
+              <w:right w:w="120" w:type="dxa"/>
+            </w:tcMar>
           </w:tcPr>
           <w:p>
             <w:r/>
@@ -626,15 +718,19 @@
                 <w:rFonts w:ascii="D2Coding" w:hAnsi="D2Coding" w:eastAsia="D2Coding" w:hint="eastAsia"/>
                 <w:b w:val="0"/>
                 <w:color w:val="0F172A"/>
-                <w:sz w:val="18"/>
+                <w:sz w:val="17"/>
               </w:rPr>
-              <w:t>4</w:t>
+              <w:t>4주</w:t>
             </w:r>
           </w:p>
         </w:tc>
         <w:tc>
           <w:tcPr>
-            <w:tcW w:type="dxa" w:w="4230"/>
+            <w:tcW w:type="dxa" w:w="4130"/>
+            <w:tcMar>
+              <w:left w:w="120" w:type="dxa"/>
+              <w:right w:w="120" w:type="dxa"/>
+            </w:tcMar>
           </w:tcPr>
           <w:p>
             <w:r/>
@@ -643,7 +739,7 @@
                 <w:rFonts w:ascii="D2Coding" w:hAnsi="D2Coding" w:eastAsia="D2Coding" w:hint="eastAsia"/>
                 <w:b w:val="0"/>
                 <w:color w:val="0F172A"/>
-                <w:sz w:val="18"/>
+                <w:sz w:val="17"/>
               </w:rPr>
               <w:t>Data definitions</w:t>
             </w:r>
@@ -651,7 +747,11 @@
         </w:tc>
         <w:tc>
           <w:tcPr>
-            <w:tcW w:type="dxa" w:w="4230"/>
+            <w:tcW w:type="dxa" w:w="4130"/>
+            <w:tcMar>
+              <w:left w:w="120" w:type="dxa"/>
+              <w:right w:w="120" w:type="dxa"/>
+            </w:tcMar>
           </w:tcPr>
           <w:p>
             <w:r/>
@@ -660,7 +760,7 @@
                 <w:rFonts w:ascii="D2Coding" w:hAnsi="D2Coding" w:eastAsia="D2Coding" w:hint="eastAsia"/>
                 <w:b w:val="0"/>
                 <w:color w:val="0F172A"/>
-                <w:sz w:val="18"/>
+                <w:sz w:val="17"/>
               </w:rPr>
               <w:t>Create tunable data fields</w:t>
             </w:r>
@@ -670,7 +770,11 @@
       <w:tr>
         <w:tc>
           <w:tcPr>
-            <w:tcW w:type="dxa" w:w="900"/>
+            <w:tcW w:type="dxa" w:w="1100"/>
+            <w:tcMar>
+              <w:left w:w="120" w:type="dxa"/>
+              <w:right w:w="120" w:type="dxa"/>
+            </w:tcMar>
           </w:tcPr>
           <w:p>
             <w:r/>
@@ -679,15 +783,19 @@
                 <w:rFonts w:ascii="D2Coding" w:hAnsi="D2Coding" w:eastAsia="D2Coding" w:hint="eastAsia"/>
                 <w:b w:val="0"/>
                 <w:color w:val="0F172A"/>
-                <w:sz w:val="18"/>
+                <w:sz w:val="17"/>
               </w:rPr>
-              <w:t>5</w:t>
+              <w:t>5주</w:t>
             </w:r>
           </w:p>
         </w:tc>
         <w:tc>
           <w:tcPr>
-            <w:tcW w:type="dxa" w:w="4230"/>
+            <w:tcW w:type="dxa" w:w="4130"/>
+            <w:tcMar>
+              <w:left w:w="120" w:type="dxa"/>
+              <w:right w:w="120" w:type="dxa"/>
+            </w:tcMar>
           </w:tcPr>
           <w:p>
             <w:r/>
@@ -696,7 +804,7 @@
                 <w:rFonts w:ascii="D2Coding" w:hAnsi="D2Coding" w:eastAsia="D2Coding" w:hint="eastAsia"/>
                 <w:b w:val="0"/>
                 <w:color w:val="0F172A"/>
-                <w:sz w:val="18"/>
+                <w:sz w:val="17"/>
               </w:rPr>
               <w:t>UI feedback</w:t>
             </w:r>
@@ -704,7 +812,11 @@
         </w:tc>
         <w:tc>
           <w:tcPr>
-            <w:tcW w:type="dxa" w:w="4230"/>
+            <w:tcW w:type="dxa" w:w="4130"/>
+            <w:tcMar>
+              <w:left w:w="120" w:type="dxa"/>
+              <w:right w:w="120" w:type="dxa"/>
+            </w:tcMar>
           </w:tcPr>
           <w:p>
             <w:r/>
@@ -713,7 +825,7 @@
                 <w:rFonts w:ascii="D2Coding" w:hAnsi="D2Coding" w:eastAsia="D2Coding" w:hint="eastAsia"/>
                 <w:b w:val="0"/>
                 <w:color w:val="0F172A"/>
-                <w:sz w:val="18"/>
+                <w:sz w:val="17"/>
               </w:rPr>
               <w:t>Map states to player-facing feedback</w:t>
             </w:r>
@@ -723,7 +835,11 @@
       <w:tr>
         <w:tc>
           <w:tcPr>
-            <w:tcW w:type="dxa" w:w="900"/>
+            <w:tcW w:type="dxa" w:w="1100"/>
+            <w:tcMar>
+              <w:left w:w="120" w:type="dxa"/>
+              <w:right w:w="120" w:type="dxa"/>
+            </w:tcMar>
           </w:tcPr>
           <w:p>
             <w:r/>
@@ -732,15 +848,19 @@
                 <w:rFonts w:ascii="D2Coding" w:hAnsi="D2Coding" w:eastAsia="D2Coding" w:hint="eastAsia"/>
                 <w:b w:val="0"/>
                 <w:color w:val="0F172A"/>
-                <w:sz w:val="18"/>
+                <w:sz w:val="17"/>
               </w:rPr>
-              <w:t>6</w:t>
+              <w:t>6주</w:t>
             </w:r>
           </w:p>
         </w:tc>
         <w:tc>
           <w:tcPr>
-            <w:tcW w:type="dxa" w:w="4230"/>
+            <w:tcW w:type="dxa" w:w="4130"/>
+            <w:tcMar>
+              <w:left w:w="120" w:type="dxa"/>
+              <w:right w:w="120" w:type="dxa"/>
+            </w:tcMar>
           </w:tcPr>
           <w:p>
             <w:r/>
@@ -749,7 +869,7 @@
                 <w:rFonts w:ascii="D2Coding" w:hAnsi="D2Coding" w:eastAsia="D2Coding" w:hint="eastAsia"/>
                 <w:b w:val="0"/>
                 <w:color w:val="0F172A"/>
-                <w:sz w:val="18"/>
+                <w:sz w:val="17"/>
               </w:rPr>
               <w:t>Prototype scope</w:t>
             </w:r>
@@ -757,7 +877,11 @@
         </w:tc>
         <w:tc>
           <w:tcPr>
-            <w:tcW w:type="dxa" w:w="4230"/>
+            <w:tcW w:type="dxa" w:w="4130"/>
+            <w:tcMar>
+              <w:left w:w="120" w:type="dxa"/>
+              <w:right w:w="120" w:type="dxa"/>
+            </w:tcMar>
           </w:tcPr>
           <w:p>
             <w:r/>
@@ -766,7 +890,7 @@
                 <w:rFonts w:ascii="D2Coding" w:hAnsi="D2Coding" w:eastAsia="D2Coding" w:hint="eastAsia"/>
                 <w:b w:val="0"/>
                 <w:color w:val="0F172A"/>
-                <w:sz w:val="18"/>
+                <w:sz w:val="17"/>
               </w:rPr>
               <w:t>Implement one playable slice</w:t>
             </w:r>
@@ -776,7 +900,11 @@
       <w:tr>
         <w:tc>
           <w:tcPr>
-            <w:tcW w:type="dxa" w:w="900"/>
+            <w:tcW w:type="dxa" w:w="1100"/>
+            <w:tcMar>
+              <w:left w:w="120" w:type="dxa"/>
+              <w:right w:w="120" w:type="dxa"/>
+            </w:tcMar>
           </w:tcPr>
           <w:p>
             <w:r/>
@@ -785,15 +913,19 @@
                 <w:rFonts w:ascii="D2Coding" w:hAnsi="D2Coding" w:eastAsia="D2Coding" w:hint="eastAsia"/>
                 <w:b w:val="0"/>
                 <w:color w:val="0F172A"/>
-                <w:sz w:val="18"/>
+                <w:sz w:val="17"/>
               </w:rPr>
-              <w:t>7</w:t>
+              <w:t>7주</w:t>
             </w:r>
           </w:p>
         </w:tc>
         <w:tc>
           <w:tcPr>
-            <w:tcW w:type="dxa" w:w="4230"/>
+            <w:tcW w:type="dxa" w:w="4130"/>
+            <w:tcMar>
+              <w:left w:w="120" w:type="dxa"/>
+              <w:right w:w="120" w:type="dxa"/>
+            </w:tcMar>
           </w:tcPr>
           <w:p>
             <w:r/>
@@ -802,7 +934,7 @@
                 <w:rFonts w:ascii="D2Coding" w:hAnsi="D2Coding" w:eastAsia="D2Coding" w:hint="eastAsia"/>
                 <w:b w:val="0"/>
                 <w:color w:val="0F172A"/>
-                <w:sz w:val="18"/>
+                <w:sz w:val="17"/>
               </w:rPr>
               <w:t>Playtest observation</w:t>
             </w:r>
@@ -810,7 +942,11 @@
         </w:tc>
         <w:tc>
           <w:tcPr>
-            <w:tcW w:type="dxa" w:w="4230"/>
+            <w:tcW w:type="dxa" w:w="4130"/>
+            <w:tcMar>
+              <w:left w:w="120" w:type="dxa"/>
+              <w:right w:w="120" w:type="dxa"/>
+            </w:tcMar>
           </w:tcPr>
           <w:p>
             <w:r/>
@@ -819,7 +955,7 @@
                 <w:rFonts w:ascii="D2Coding" w:hAnsi="D2Coding" w:eastAsia="D2Coding" w:hint="eastAsia"/>
                 <w:b w:val="0"/>
                 <w:color w:val="0F172A"/>
-                <w:sz w:val="18"/>
+                <w:sz w:val="17"/>
               </w:rPr>
               <w:t>Run one observed session</w:t>
             </w:r>
@@ -829,7 +965,11 @@
       <w:tr>
         <w:tc>
           <w:tcPr>
-            <w:tcW w:type="dxa" w:w="900"/>
+            <w:tcW w:type="dxa" w:w="1100"/>
+            <w:tcMar>
+              <w:left w:w="120" w:type="dxa"/>
+              <w:right w:w="120" w:type="dxa"/>
+            </w:tcMar>
           </w:tcPr>
           <w:p>
             <w:r/>
@@ -838,15 +978,19 @@
                 <w:rFonts w:ascii="D2Coding" w:hAnsi="D2Coding" w:eastAsia="D2Coding" w:hint="eastAsia"/>
                 <w:b w:val="0"/>
                 <w:color w:val="0F172A"/>
-                <w:sz w:val="18"/>
+                <w:sz w:val="17"/>
               </w:rPr>
-              <w:t>8</w:t>
+              <w:t>8주</w:t>
             </w:r>
           </w:p>
         </w:tc>
         <w:tc>
           <w:tcPr>
-            <w:tcW w:type="dxa" w:w="4230"/>
+            <w:tcW w:type="dxa" w:w="4130"/>
+            <w:tcMar>
+              <w:left w:w="120" w:type="dxa"/>
+              <w:right w:w="120" w:type="dxa"/>
+            </w:tcMar>
           </w:tcPr>
           <w:p>
             <w:r/>
@@ -855,7 +999,7 @@
                 <w:rFonts w:ascii="D2Coding" w:hAnsi="D2Coding" w:eastAsia="D2Coding" w:hint="eastAsia"/>
                 <w:b w:val="0"/>
                 <w:color w:val="0F172A"/>
-                <w:sz w:val="18"/>
+                <w:sz w:val="17"/>
               </w:rPr>
               <w:t>Evidence-led iteration</w:t>
             </w:r>
@@ -863,7 +1007,11 @@
         </w:tc>
         <w:tc>
           <w:tcPr>
-            <w:tcW w:type="dxa" w:w="4230"/>
+            <w:tcW w:type="dxa" w:w="4130"/>
+            <w:tcMar>
+              <w:left w:w="120" w:type="dxa"/>
+              <w:right w:w="120" w:type="dxa"/>
+            </w:tcMar>
           </w:tcPr>
           <w:p>
             <w:r/>
@@ -872,7 +1020,7 @@
                 <w:rFonts w:ascii="D2Coding" w:hAnsi="D2Coding" w:eastAsia="D2Coding" w:hint="eastAsia"/>
                 <w:b w:val="0"/>
                 <w:color w:val="0F172A"/>
-                <w:sz w:val="18"/>
+                <w:sz w:val="17"/>
               </w:rPr>
               <w:t>Change one rule from evidence</w:t>
             </w:r>
@@ -882,7 +1030,11 @@
       <w:tr>
         <w:tc>
           <w:tcPr>
-            <w:tcW w:type="dxa" w:w="900"/>
+            <w:tcW w:type="dxa" w:w="1100"/>
+            <w:tcMar>
+              <w:left w:w="120" w:type="dxa"/>
+              <w:right w:w="120" w:type="dxa"/>
+            </w:tcMar>
           </w:tcPr>
           <w:p>
             <w:r/>
@@ -891,15 +1043,19 @@
                 <w:rFonts w:ascii="D2Coding" w:hAnsi="D2Coding" w:eastAsia="D2Coding" w:hint="eastAsia"/>
                 <w:b w:val="0"/>
                 <w:color w:val="0F172A"/>
-                <w:sz w:val="18"/>
+                <w:sz w:val="17"/>
               </w:rPr>
-              <w:t>9</w:t>
+              <w:t>9주</w:t>
             </w:r>
           </w:p>
         </w:tc>
         <w:tc>
           <w:tcPr>
-            <w:tcW w:type="dxa" w:w="4230"/>
+            <w:tcW w:type="dxa" w:w="4130"/>
+            <w:tcMar>
+              <w:left w:w="120" w:type="dxa"/>
+              <w:right w:w="120" w:type="dxa"/>
+            </w:tcMar>
           </w:tcPr>
           <w:p>
             <w:r/>
@@ -908,7 +1064,7 @@
                 <w:rFonts w:ascii="D2Coding" w:hAnsi="D2Coding" w:eastAsia="D2Coding" w:hint="eastAsia"/>
                 <w:b w:val="0"/>
                 <w:color w:val="0F172A"/>
-                <w:sz w:val="18"/>
+                <w:sz w:val="17"/>
               </w:rPr>
               <w:t>Alternative design</w:t>
             </w:r>
@@ -916,7 +1072,11 @@
         </w:tc>
         <w:tc>
           <w:tcPr>
-            <w:tcW w:type="dxa" w:w="4230"/>
+            <w:tcW w:type="dxa" w:w="4130"/>
+            <w:tcMar>
+              <w:left w:w="120" w:type="dxa"/>
+              <w:right w:w="120" w:type="dxa"/>
+            </w:tcMar>
           </w:tcPr>
           <w:p>
             <w:r/>
@@ -925,7 +1085,7 @@
                 <w:rFonts w:ascii="D2Coding" w:hAnsi="D2Coding" w:eastAsia="D2Coding" w:hint="eastAsia"/>
                 <w:b w:val="0"/>
                 <w:color w:val="0F172A"/>
-                <w:sz w:val="18"/>
+                <w:sz w:val="17"/>
               </w:rPr>
               <w:t>Compare two alternatives</w:t>
             </w:r>
@@ -935,7 +1095,11 @@
       <w:tr>
         <w:tc>
           <w:tcPr>
-            <w:tcW w:type="dxa" w:w="900"/>
+            <w:tcW w:type="dxa" w:w="1100"/>
+            <w:tcMar>
+              <w:left w:w="120" w:type="dxa"/>
+              <w:right w:w="120" w:type="dxa"/>
+            </w:tcMar>
           </w:tcPr>
           <w:p>
             <w:r/>
@@ -944,15 +1108,19 @@
                 <w:rFonts w:ascii="D2Coding" w:hAnsi="D2Coding" w:eastAsia="D2Coding" w:hint="eastAsia"/>
                 <w:b w:val="0"/>
                 <w:color w:val="0F172A"/>
-                <w:sz w:val="18"/>
+                <w:sz w:val="17"/>
               </w:rPr>
-              <w:t>10</w:t>
+              <w:t>10주</w:t>
             </w:r>
           </w:p>
         </w:tc>
         <w:tc>
           <w:tcPr>
-            <w:tcW w:type="dxa" w:w="4230"/>
+            <w:tcW w:type="dxa" w:w="4130"/>
+            <w:tcMar>
+              <w:left w:w="120" w:type="dxa"/>
+              <w:right w:w="120" w:type="dxa"/>
+            </w:tcMar>
           </w:tcPr>
           <w:p>
             <w:r/>
@@ -961,7 +1129,7 @@
                 <w:rFonts w:ascii="D2Coding" w:hAnsi="D2Coding" w:eastAsia="D2Coding" w:hint="eastAsia"/>
                 <w:b w:val="0"/>
                 <w:color w:val="0F172A"/>
-                <w:sz w:val="18"/>
+                <w:sz w:val="17"/>
               </w:rPr>
               <w:t>Implementation handoff</w:t>
             </w:r>
@@ -969,7 +1137,11 @@
         </w:tc>
         <w:tc>
           <w:tcPr>
-            <w:tcW w:type="dxa" w:w="4230"/>
+            <w:tcW w:type="dxa" w:w="4130"/>
+            <w:tcMar>
+              <w:left w:w="120" w:type="dxa"/>
+              <w:right w:w="120" w:type="dxa"/>
+            </w:tcMar>
           </w:tcPr>
           <w:p>
             <w:r/>
@@ -978,7 +1150,7 @@
                 <w:rFonts w:ascii="D2Coding" w:hAnsi="D2Coding" w:eastAsia="D2Coding" w:hint="eastAsia"/>
                 <w:b w:val="0"/>
                 <w:color w:val="0F172A"/>
-                <w:sz w:val="18"/>
+                <w:sz w:val="17"/>
               </w:rPr>
               <w:t>Package rules, data, and acceptance cases</w:t>
             </w:r>
@@ -988,7 +1160,11 @@
       <w:tr>
         <w:tc>
           <w:tcPr>
-            <w:tcW w:type="dxa" w:w="900"/>
+            <w:tcW w:type="dxa" w:w="1100"/>
+            <w:tcMar>
+              <w:left w:w="120" w:type="dxa"/>
+              <w:right w:w="120" w:type="dxa"/>
+            </w:tcMar>
           </w:tcPr>
           <w:p>
             <w:r/>
@@ -997,15 +1173,19 @@
                 <w:rFonts w:ascii="D2Coding" w:hAnsi="D2Coding" w:eastAsia="D2Coding" w:hint="eastAsia"/>
                 <w:b w:val="0"/>
                 <w:color w:val="0F172A"/>
-                <w:sz w:val="18"/>
+                <w:sz w:val="17"/>
               </w:rPr>
-              <w:t>11</w:t>
+              <w:t>11주</w:t>
             </w:r>
           </w:p>
         </w:tc>
         <w:tc>
           <w:tcPr>
-            <w:tcW w:type="dxa" w:w="4230"/>
+            <w:tcW w:type="dxa" w:w="4130"/>
+            <w:tcMar>
+              <w:left w:w="120" w:type="dxa"/>
+              <w:right w:w="120" w:type="dxa"/>
+            </w:tcMar>
           </w:tcPr>
           <w:p>
             <w:r/>
@@ -1014,7 +1194,7 @@
                 <w:rFonts w:ascii="D2Coding" w:hAnsi="D2Coding" w:eastAsia="D2Coding" w:hint="eastAsia"/>
                 <w:b w:val="0"/>
                 <w:color w:val="0F172A"/>
-                <w:sz w:val="18"/>
+                <w:sz w:val="17"/>
               </w:rPr>
               <w:t>Portfolio evidence</w:t>
             </w:r>
@@ -1022,7 +1202,11 @@
         </w:tc>
         <w:tc>
           <w:tcPr>
-            <w:tcW w:type="dxa" w:w="4230"/>
+            <w:tcW w:type="dxa" w:w="4130"/>
+            <w:tcMar>
+              <w:left w:w="120" w:type="dxa"/>
+              <w:right w:w="120" w:type="dxa"/>
+            </w:tcMar>
           </w:tcPr>
           <w:p>
             <w:r/>
@@ -1031,7 +1215,7 @@
                 <w:rFonts w:ascii="D2Coding" w:hAnsi="D2Coding" w:eastAsia="D2Coding" w:hint="eastAsia"/>
                 <w:b w:val="0"/>
                 <w:color w:val="0F172A"/>
-                <w:sz w:val="18"/>
+                <w:sz w:val="17"/>
               </w:rPr>
               <w:t>Draft a decision-centered brief</w:t>
             </w:r>
@@ -1041,7 +1225,11 @@
       <w:tr>
         <w:tc>
           <w:tcPr>
-            <w:tcW w:type="dxa" w:w="900"/>
+            <w:tcW w:type="dxa" w:w="1100"/>
+            <w:tcMar>
+              <w:left w:w="120" w:type="dxa"/>
+              <w:right w:w="120" w:type="dxa"/>
+            </w:tcMar>
           </w:tcPr>
           <w:p>
             <w:r/>
@@ -1050,15 +1238,19 @@
                 <w:rFonts w:ascii="D2Coding" w:hAnsi="D2Coding" w:eastAsia="D2Coding" w:hint="eastAsia"/>
                 <w:b w:val="0"/>
                 <w:color w:val="0F172A"/>
-                <w:sz w:val="18"/>
+                <w:sz w:val="17"/>
               </w:rPr>
-              <w:t>12</w:t>
+              <w:t>12주</w:t>
             </w:r>
           </w:p>
         </w:tc>
         <w:tc>
           <w:tcPr>
-            <w:tcW w:type="dxa" w:w="4230"/>
+            <w:tcW w:type="dxa" w:w="4130"/>
+            <w:tcMar>
+              <w:left w:w="120" w:type="dxa"/>
+              <w:right w:w="120" w:type="dxa"/>
+            </w:tcMar>
           </w:tcPr>
           <w:p>
             <w:r/>
@@ -1067,7 +1259,7 @@
                 <w:rFonts w:ascii="D2Coding" w:hAnsi="D2Coding" w:eastAsia="D2Coding" w:hint="eastAsia"/>
                 <w:b w:val="0"/>
                 <w:color w:val="0F172A"/>
-                <w:sz w:val="18"/>
+                <w:sz w:val="17"/>
               </w:rPr>
               <w:t>Retrospective and next gap</w:t>
             </w:r>
@@ -1075,7 +1267,11 @@
         </w:tc>
         <w:tc>
           <w:tcPr>
-            <w:tcW w:type="dxa" w:w="4230"/>
+            <w:tcW w:type="dxa" w:w="4130"/>
+            <w:tcMar>
+              <w:left w:w="120" w:type="dxa"/>
+              <w:right w:w="120" w:type="dxa"/>
+            </w:tcMar>
           </w:tcPr>
           <w:p>
             <w:r/>
@@ -1084,7 +1280,7 @@
                 <w:rFonts w:ascii="D2Coding" w:hAnsi="D2Coding" w:eastAsia="D2Coding" w:hint="eastAsia"/>
                 <w:b w:val="0"/>
                 <w:color w:val="0F172A"/>
-                <w:sz w:val="18"/>
+                <w:sz w:val="17"/>
               </w:rPr>
               <w:t>Publish the bounded artifact</w:t>
             </w:r>

</xml_diff>